<commit_message>
load and search heroes
</commit_message>
<xml_diff>
--- a/Soul Hero.docx
+++ b/Soul Hero.docx
@@ -116,7 +116,6 @@
         </w:rPr>
         <w:t>✅</w:t>
       </w:r>
-      <w:proofErr w:type="spellStart"/>
       <w:r>
         <w:t>Hero</w:t>
       </w:r>
@@ -126,7 +125,6 @@
       <w:r>
         <w:t>selection</w:t>
       </w:r>
-      <w:proofErr w:type="spellEnd"/>
       <w:r>
         <w:br/>
       </w:r>
@@ -148,7 +146,6 @@
         </w:rPr>
         <w:t>✅</w:t>
       </w:r>
-      <w:proofErr w:type="spellStart"/>
       <w:r>
         <w:t>PvP</w:t>
       </w:r>
@@ -158,7 +155,6 @@
       <w:r>
         <w:t>battle</w:t>
       </w:r>
-      <w:proofErr w:type="spellEnd"/>
       <w:r>
         <w:br/>
       </w:r>
@@ -168,7 +164,6 @@
         </w:rPr>
         <w:t>✅</w:t>
       </w:r>
-      <w:proofErr w:type="spellStart"/>
       <w:r>
         <w:t>Bond</w:t>
       </w:r>
@@ -178,7 +173,6 @@
       <w:r>
         <w:t>EXP</w:t>
       </w:r>
-      <w:proofErr w:type="spellEnd"/>
       <w:r>
         <w:br/>
       </w:r>
@@ -240,7 +234,6 @@
         </w:rPr>
         <w:t>❌</w:t>
       </w:r>
-      <w:proofErr w:type="spellStart"/>
       <w:r>
         <w:t>Hero</w:t>
       </w:r>
@@ -250,7 +243,6 @@
       <w:r>
         <w:t>skills</w:t>
       </w:r>
-      <w:proofErr w:type="spellEnd"/>
       <w:r>
         <w:br/>
       </w:r>
@@ -407,13 +399,8 @@
       </w:r>
     </w:p>
     <w:p>
-      <w:proofErr w:type="spellStart"/>
-      <w:r>
-        <w:t>SoulHero</w:t>
-      </w:r>
-      <w:proofErr w:type="spellEnd"/>
-      <w:r>
-        <w:t>/</w:t>
+      <w:r>
+        <w:t>SoulHero/</w:t>
       </w:r>
     </w:p>
     <w:p>
@@ -514,17 +501,8 @@
           <w:b/>
           <w:bCs/>
         </w:rPr>
-        <w:t>/</w:t>
-      </w:r>
-      <w:proofErr w:type="gramStart"/>
-      <w:r>
-        <w:rPr>
-          <w:b/>
-          <w:bCs/>
-        </w:rPr>
-        <w:t>start</w:t>
-      </w:r>
-      <w:proofErr w:type="gramEnd"/>
+        <w:t>/start</w:t>
+      </w:r>
     </w:p>
     <w:p>
       <w:r>
@@ -553,13 +531,8 @@
     </w:p>
     <w:p>
       <w:r>
-        <w:t>/</w:t>
-      </w:r>
-      <w:proofErr w:type="gramStart"/>
-      <w:r>
-        <w:t>start</w:t>
-      </w:r>
-      <w:proofErr w:type="gramEnd"/>
+        <w:t>/start</w:t>
+      </w:r>
     </w:p>
     <w:p>
       <w:r>
@@ -1190,15 +1163,7 @@
     </w:p>
     <w:p>
       <w:r>
-        <w:t xml:space="preserve">Their victories </w:t>
-      </w:r>
-      <w:proofErr w:type="gramStart"/>
-      <w:r>
-        <w:t>forgotten</w:t>
-      </w:r>
-      <w:proofErr w:type="gramEnd"/>
-      <w:r>
-        <w:t>.</w:t>
+        <w:t>Their victories forgotten.</w:t>
       </w:r>
     </w:p>
     <w:p>
@@ -1492,13 +1457,8 @@
       </w:r>
     </w:p>
     <w:p>
-      <w:proofErr w:type="spellStart"/>
-      <w:r>
-        <w:t>SoulHero</w:t>
-      </w:r>
-      <w:proofErr w:type="spellEnd"/>
-      <w:r>
-        <w:t>/</w:t>
+      <w:r>
+        <w:t>SoulHero/</w:t>
       </w:r>
     </w:p>
     <w:p>
@@ -1634,23 +1594,14 @@
     </w:p>
     <w:p>
       <w:r>
-        <w:t xml:space="preserve">    └── </w:t>
-      </w:r>
-      <w:proofErr w:type="spellStart"/>
-      <w:proofErr w:type="gramStart"/>
-      <w:r>
-        <w:t>heroes.json</w:t>
-      </w:r>
-      <w:proofErr w:type="spellEnd"/>
-      <w:proofErr w:type="gramEnd"/>
+        <w:t xml:space="preserve">    └── heroes.json</w:t>
+      </w:r>
     </w:p>
     <w:p/>
     <w:p>
-      <w:proofErr w:type="spellStart"/>
       <w:r>
         <w:t>SoulHero</w:t>
       </w:r>
-      <w:proofErr w:type="spellEnd"/>
     </w:p>
     <w:p>
       <w:r>
@@ -1689,15 +1640,8 @@
     </w:p>
     <w:p>
       <w:r>
-        <w:t xml:space="preserve">│   └── </w:t>
-      </w:r>
-      <w:proofErr w:type="spellStart"/>
-      <w:proofErr w:type="gramStart"/>
-      <w:r>
-        <w:t>heroes.json</w:t>
-      </w:r>
-      <w:proofErr w:type="spellEnd"/>
-      <w:proofErr w:type="gramEnd"/>
+        <w:t>│   └── heroes.json</w:t>
+      </w:r>
     </w:p>
     <w:p>
       <w:r>
@@ -1721,28 +1665,13 @@
     </w:p>
     <w:p>
       <w:r>
-        <w:t>├─</w:t>
-      </w:r>
-      <w:proofErr w:type="gramStart"/>
-      <w:r>
-        <w:t>─ .env</w:t>
-      </w:r>
-      <w:proofErr w:type="gramEnd"/>
-    </w:p>
-    <w:p>
-      <w:r>
-        <w:t>├─</w:t>
-      </w:r>
-      <w:proofErr w:type="gramStart"/>
-      <w:r>
-        <w:t>─ .</w:t>
-      </w:r>
-      <w:proofErr w:type="spellStart"/>
-      <w:r>
-        <w:t>gitignore</w:t>
-      </w:r>
-      <w:proofErr w:type="spellEnd"/>
-      <w:proofErr w:type="gramEnd"/>
+        <w:t>├── .env</w:t>
+      </w:r>
+    </w:p>
+    <w:p>
+      <w:r>
+        <w:t>├── .gitignore</w:t>
+      </w:r>
     </w:p>
     <w:p>
       <w:r>
@@ -1763,25 +1692,12 @@
     <w:p/>
     <w:p>
       <w:r>
-        <w:t xml:space="preserve">This shit </w:t>
-      </w:r>
-      <w:proofErr w:type="gramStart"/>
-      <w:r>
-        <w:t>good</w:t>
-      </w:r>
-      <w:proofErr w:type="gramEnd"/>
-      <w:r>
-        <w:t>:</w:t>
-      </w:r>
-    </w:p>
-    <w:p>
-      <w:proofErr w:type="spellStart"/>
-      <w:r>
-        <w:t>SoulHero</w:t>
-      </w:r>
-      <w:proofErr w:type="spellEnd"/>
-      <w:r>
-        <w:t>/</w:t>
+        <w:t>This shit good:</w:t>
+      </w:r>
+    </w:p>
+    <w:p>
+      <w:r>
+        <w:t>SoulHero/</w:t>
       </w:r>
     </w:p>
     <w:p>
@@ -1924,15 +1840,8 @@
     </w:p>
     <w:p>
       <w:r>
-        <w:t xml:space="preserve">│   └── </w:t>
-      </w:r>
-      <w:proofErr w:type="spellStart"/>
-      <w:proofErr w:type="gramStart"/>
-      <w:r>
-        <w:t>heroes.json</w:t>
-      </w:r>
-      <w:proofErr w:type="spellEnd"/>
-      <w:proofErr w:type="gramEnd"/>
+        <w:t>│   └── heroes.json</w:t>
+      </w:r>
     </w:p>
     <w:p>
       <w:r>
@@ -1962,28 +1871,13 @@
     </w:p>
     <w:p>
       <w:r>
-        <w:t>├─</w:t>
-      </w:r>
-      <w:proofErr w:type="gramStart"/>
-      <w:r>
-        <w:t>─ .env</w:t>
-      </w:r>
-      <w:proofErr w:type="gramEnd"/>
-    </w:p>
-    <w:p>
-      <w:r>
-        <w:t>├─</w:t>
-      </w:r>
-      <w:proofErr w:type="gramStart"/>
-      <w:r>
-        <w:t>─ .</w:t>
-      </w:r>
-      <w:proofErr w:type="spellStart"/>
-      <w:r>
-        <w:t>gitignore</w:t>
-      </w:r>
-      <w:proofErr w:type="spellEnd"/>
-      <w:proofErr w:type="gramEnd"/>
+        <w:t>├── .env</w:t>
+      </w:r>
+    </w:p>
+    <w:p>
+      <w:r>
+        <w:t>├── .gitignore</w:t>
+      </w:r>
     </w:p>
     <w:p>
       <w:r>
@@ -2070,13 +1964,8 @@
       </w:r>
     </w:p>
     <w:p>
-      <w:proofErr w:type="spellStart"/>
-      <w:r>
-        <w:t>SoulHero</w:t>
-      </w:r>
-      <w:proofErr w:type="spellEnd"/>
-      <w:r>
-        <w:t>/</w:t>
+      <w:r>
+        <w:t>SoulHero/</w:t>
       </w:r>
     </w:p>
     <w:p>
@@ -2404,13 +2293,8 @@
         <w:spacing w:line="278" w:lineRule="auto"/>
         <w:jc w:val="left"/>
       </w:pPr>
-      <w:proofErr w:type="spellStart"/>
-      <w:r>
-        <w:t>SoulHero</w:t>
-      </w:r>
-      <w:proofErr w:type="spellEnd"/>
-      <w:r>
-        <w:t>/</w:t>
+      <w:r>
+        <w:t>SoulHero/</w:t>
       </w:r>
     </w:p>
     <w:p>
@@ -2554,13 +2438,8 @@
         <w:jc w:val="left"/>
       </w:pPr>
       <w:r>
-        <w:t>├─</w:t>
-      </w:r>
-      <w:proofErr w:type="gramStart"/>
-      <w:r>
-        <w:t>─ .env</w:t>
-      </w:r>
-      <w:proofErr w:type="gramEnd"/>
+        <w:t>├── .env</w:t>
+      </w:r>
     </w:p>
     <w:p>
       <w:pPr>
@@ -3194,15 +3073,7 @@
     </w:p>
     <w:p>
       <w:r>
-        <w:t xml:space="preserve">Victory depends on the </w:t>
-      </w:r>
-      <w:proofErr w:type="spellStart"/>
-      <w:r>
-        <w:t>Oathbound's</w:t>
-      </w:r>
-      <w:proofErr w:type="spellEnd"/>
-      <w:r>
-        <w:t xml:space="preserve"> choices, strategy, and Resonance—not on picking the "meta" Hero.</w:t>
+        <w:t>Victory depends on the Oathbound's choices, strategy, and Resonance—not on picking the "meta" Hero.</w:t>
       </w:r>
     </w:p>
     <w:p>
@@ -3293,29 +3164,12 @@
           <w:b/>
           <w:bCs/>
         </w:rPr>
-        <w:t xml:space="preserve">V. Every Feature Must Have </w:t>
-      </w:r>
-      <w:proofErr w:type="gramStart"/>
-      <w:r>
-        <w:rPr>
-          <w:b/>
-          <w:bCs/>
-        </w:rPr>
-        <w:t>Meaning</w:t>
-      </w:r>
-      <w:proofErr w:type="gramEnd"/>
-    </w:p>
-    <w:p>
-      <w:r>
-        <w:t xml:space="preserve">Before adding any </w:t>
-      </w:r>
-      <w:proofErr w:type="gramStart"/>
-      <w:r>
-        <w:t>feature</w:t>
-      </w:r>
-      <w:proofErr w:type="gramEnd"/>
-      <w:r>
-        <w:t xml:space="preserve"> we ask:</w:t>
+        <w:t>V. Every Feature Must Have Meaning</w:t>
+      </w:r>
+    </w:p>
+    <w:p>
+      <w:r>
+        <w:t>Before adding any feature we ask:</w:t>
       </w:r>
     </w:p>
     <w:p>
@@ -3404,15 +3258,7 @@
     </w:p>
     <w:p>
       <w:r>
-        <w:t xml:space="preserve">A mysterious observer witnessed a </w:t>
-      </w:r>
-      <w:proofErr w:type="gramStart"/>
-      <w:r>
-        <w:t>fracture in reality</w:t>
-      </w:r>
-      <w:proofErr w:type="gramEnd"/>
-      <w:r>
-        <w:t>.</w:t>
+        <w:t>A mysterious observer witnessed a fracture in reality.</w:t>
       </w:r>
     </w:p>
     <w:p>
@@ -3439,21 +3285,12 @@
           <w:bCs/>
         </w:rPr>
       </w:pPr>
-      <w:proofErr w:type="gramStart"/>
-      <w:r>
-        <w:rPr>
-          <w:b/>
-          <w:bCs/>
-        </w:rPr>
-        <w:t>The Memory</w:t>
-      </w:r>
-      <w:proofErr w:type="gramEnd"/>
-      <w:r>
-        <w:rPr>
-          <w:b/>
-          <w:bCs/>
-        </w:rPr>
-        <w:t xml:space="preserve"> Loss</w:t>
+      <w:r>
+        <w:rPr>
+          <w:b/>
+          <w:bCs/>
+        </w:rPr>
+        <w:t>The Memory Loss</w:t>
       </w:r>
     </w:p>
     <w:p>
@@ -3541,13 +3378,8 @@
       </w:r>
     </w:p>
     <w:p>
-      <w:proofErr w:type="gramStart"/>
-      <w:r>
-        <w:t>an</w:t>
-      </w:r>
-      <w:proofErr w:type="gramEnd"/>
-      <w:r>
-        <w:t xml:space="preserve"> Oath is formed.</w:t>
+      <w:r>
+        <w:t>an Oath is formed.</w:t>
       </w:r>
     </w:p>
     <w:p>
@@ -3764,13 +3596,8 @@
             <w:hideMark/>
           </w:tcPr>
           <w:p>
-            <w:proofErr w:type="gramStart"/>
             <w:r>
-              <w:t>The ancient</w:t>
-            </w:r>
-            <w:proofErr w:type="gramEnd"/>
-            <w:r>
-              <w:t xml:space="preserve"> force connecting both worlds.</w:t>
+              <w:t>The ancient force connecting both worlds.</w:t>
             </w:r>
           </w:p>
         </w:tc>
@@ -4216,15 +4043,7 @@
     <w:p>
       <w:r>
         <w:lastRenderedPageBreak/>
-        <w:t xml:space="preserve">The purpose is the </w:t>
-      </w:r>
-      <w:proofErr w:type="gramStart"/>
-      <w:r>
-        <w:t>relationship</w:t>
-      </w:r>
-      <w:proofErr w:type="gramEnd"/>
-      <w:r>
-        <w:t>.</w:t>
+        <w:t>The purpose is the relationship.</w:t>
       </w:r>
     </w:p>
     <w:p>
@@ -5440,13 +5259,8 @@
     </w:p>
     <w:p>
       <w:r>
-        <w:t xml:space="preserve">├── </w:t>
-      </w:r>
-      <w:proofErr w:type="spellStart"/>
-      <w:r>
-        <w:t>discord_id</w:t>
-      </w:r>
-      <w:proofErr w:type="spellEnd"/>
+        <w:t>├── discord_id</w:t>
+      </w:r>
     </w:p>
     <w:p>
       <w:r>
@@ -5465,23 +5279,13 @@
     </w:p>
     <w:p>
       <w:r>
-        <w:t xml:space="preserve">├── </w:t>
-      </w:r>
-      <w:proofErr w:type="spellStart"/>
-      <w:r>
-        <w:t>resonance_level</w:t>
-      </w:r>
-      <w:proofErr w:type="spellEnd"/>
-    </w:p>
-    <w:p>
-      <w:r>
-        <w:t xml:space="preserve">└── </w:t>
-      </w:r>
-      <w:proofErr w:type="spellStart"/>
-      <w:r>
-        <w:t>created_at</w:t>
-      </w:r>
-      <w:proofErr w:type="spellEnd"/>
+        <w:t>├── resonance_level</w:t>
+      </w:r>
+    </w:p>
+    <w:p>
+      <w:r>
+        <w:t>└── created_at</w:t>
+      </w:r>
     </w:p>
     <w:p>
       <w:r>
@@ -5605,23 +5409,7 @@
           <w:b/>
           <w:bCs/>
         </w:rPr>
-        <w:t xml:space="preserve">Step 2: </w:t>
-      </w:r>
-      <w:proofErr w:type="gramStart"/>
-      <w:r>
-        <w:rPr>
-          <w:b/>
-          <w:bCs/>
-        </w:rPr>
-        <w:t>Decide</w:t>
-      </w:r>
-      <w:proofErr w:type="gramEnd"/>
-      <w:r>
-        <w:rPr>
-          <w:b/>
-          <w:bCs/>
-        </w:rPr>
-        <w:t xml:space="preserve"> our database</w:t>
+        <w:t>Step 2: Decide our database</w:t>
       </w:r>
     </w:p>
     <w:p>
@@ -5846,13 +5634,8 @@
     </w:p>
     <w:p>
       <w:r>
-        <w:t>└─</w:t>
-      </w:r>
-      <w:proofErr w:type="gramStart"/>
-      <w:r>
-        <w:t>─ .env</w:t>
-      </w:r>
-      <w:proofErr w:type="gramEnd"/>
+        <w:t>└── .env</w:t>
+      </w:r>
     </w:p>
     <w:p>
       <w:r>
@@ -6111,33 +5894,18 @@
     </w:p>
     <w:p>
       <w:r>
-        <w:t>/</w:t>
-      </w:r>
-      <w:proofErr w:type="gramStart"/>
-      <w:r>
-        <w:t>challenge</w:t>
-      </w:r>
-      <w:proofErr w:type="gramEnd"/>
-    </w:p>
-    <w:p>
-      <w:r>
-        <w:t>/</w:t>
-      </w:r>
-      <w:proofErr w:type="gramStart"/>
-      <w:r>
-        <w:t>dungeon</w:t>
-      </w:r>
-      <w:proofErr w:type="gramEnd"/>
-    </w:p>
-    <w:p>
-      <w:r>
-        <w:t>/</w:t>
-      </w:r>
-      <w:proofErr w:type="gramStart"/>
-      <w:r>
-        <w:t>profile</w:t>
-      </w:r>
-      <w:proofErr w:type="gramEnd"/>
+        <w:t>/challenge</w:t>
+      </w:r>
+    </w:p>
+    <w:p>
+      <w:r>
+        <w:t>/dungeon</w:t>
+      </w:r>
+    </w:p>
+    <w:p>
+      <w:r>
+        <w:t>/profile</w:t>
+      </w:r>
     </w:p>
     <w:p>
       <w:r>
@@ -6796,11 +6564,9 @@
       </w:r>
     </w:p>
     <w:p>
-      <w:proofErr w:type="gramStart"/>
       <w:r>
         <w:t>say</w:t>
       </w:r>
-      <w:proofErr w:type="gramEnd"/>
     </w:p>
     <w:p>
       <w:r>
@@ -6825,12 +6591,10 @@
       </w:r>
     </w:p>
     <w:p>
-      <w:proofErr w:type="gramStart"/>
       <w:r>
         <w:lastRenderedPageBreak/>
         <w:t>say</w:t>
       </w:r>
-      <w:proofErr w:type="gramEnd"/>
     </w:p>
     <w:p>
       <w:r>
@@ -6855,11 +6619,9 @@
       </w:r>
     </w:p>
     <w:p>
-      <w:proofErr w:type="gramStart"/>
       <w:r>
         <w:t>say</w:t>
       </w:r>
-      <w:proofErr w:type="gramEnd"/>
     </w:p>
     <w:p>
       <w:r>
@@ -6884,11 +6646,9 @@
       </w:r>
     </w:p>
     <w:p>
-      <w:proofErr w:type="gramStart"/>
       <w:r>
         <w:t>say</w:t>
       </w:r>
-      <w:proofErr w:type="gramEnd"/>
     </w:p>
     <w:p>
       <w:r>
@@ -6913,11 +6673,9 @@
       </w:r>
     </w:p>
     <w:p>
-      <w:proofErr w:type="gramStart"/>
       <w:r>
         <w:t>say</w:t>
       </w:r>
-      <w:proofErr w:type="gramEnd"/>
     </w:p>
     <w:p>
       <w:r>
@@ -6962,11 +6720,9 @@
       </w:r>
     </w:p>
     <w:p>
-      <w:proofErr w:type="gramStart"/>
       <w:r>
         <w:t>say</w:t>
       </w:r>
-      <w:proofErr w:type="gramEnd"/>
     </w:p>
     <w:p>
       <w:r>
@@ -7059,11 +6815,9 @@
       </w:r>
     </w:p>
     <w:p>
-      <w:proofErr w:type="gramStart"/>
       <w:r>
         <w:t>say</w:t>
       </w:r>
-      <w:proofErr w:type="gramEnd"/>
     </w:p>
     <w:p>
       <w:r>
@@ -7088,11 +6842,9 @@
       </w:r>
     </w:p>
     <w:p>
-      <w:proofErr w:type="gramStart"/>
       <w:r>
         <w:t>say</w:t>
       </w:r>
-      <w:proofErr w:type="gramEnd"/>
     </w:p>
     <w:p>
       <w:r>
@@ -7218,11 +6970,9 @@
       </w:r>
     </w:p>
     <w:p>
-      <w:proofErr w:type="gramStart"/>
       <w:r>
         <w:t>say</w:t>
       </w:r>
-      <w:proofErr w:type="gramEnd"/>
     </w:p>
     <w:p>
       <w:r>
@@ -7276,11 +7026,9 @@
       </w:r>
     </w:p>
     <w:p>
-      <w:proofErr w:type="gramStart"/>
       <w:r>
         <w:t>say</w:t>
       </w:r>
-      <w:proofErr w:type="gramEnd"/>
     </w:p>
     <w:p>
       <w:r>
@@ -7306,11 +7054,9 @@
       </w:r>
     </w:p>
     <w:p>
-      <w:proofErr w:type="gramStart"/>
       <w:r>
         <w:t>say</w:t>
       </w:r>
-      <w:proofErr w:type="gramEnd"/>
     </w:p>
     <w:p>
       <w:r>
@@ -7335,11 +7081,9 @@
       </w:r>
     </w:p>
     <w:p>
-      <w:proofErr w:type="gramStart"/>
       <w:r>
         <w:t>say</w:t>
       </w:r>
-      <w:proofErr w:type="gramEnd"/>
     </w:p>
     <w:p>
       <w:r>
@@ -7364,11 +7108,9 @@
       </w:r>
     </w:p>
     <w:p>
-      <w:proofErr w:type="gramStart"/>
       <w:r>
         <w:t>say</w:t>
       </w:r>
-      <w:proofErr w:type="gramEnd"/>
     </w:p>
     <w:p>
       <w:r>
@@ -7921,19 +7663,1032 @@
             <w:hideMark/>
           </w:tcPr>
           <w:p>
-            <w:proofErr w:type="gramStart"/>
             <w:r>
-              <w:t>Sever</w:t>
-            </w:r>
-            <w:proofErr w:type="gramEnd"/>
-            <w:r>
-              <w:t xml:space="preserve"> the Oath</w:t>
+              <w:t>Sever the Oath</w:t>
             </w:r>
           </w:p>
         </w:tc>
       </w:tr>
     </w:tbl>
     <w:p/>
+    <w:p>
+      <w:pPr>
+        <w:spacing w:line="278" w:lineRule="auto"/>
+        <w:jc w:val="left"/>
+      </w:pPr>
+      <w:r>
+        <w:br w:type="page"/>
+      </w:r>
+    </w:p>
+    <w:p>
+      <w:r>
+        <w:lastRenderedPageBreak/>
+        <w:t>Final structure</w:t>
+      </w:r>
+    </w:p>
+    <w:p>
+      <w:r>
+        <w:t>Soul Hero/</w:t>
+      </w:r>
+    </w:p>
+    <w:p>
+      <w:r>
+        <w:t>│</w:t>
+      </w:r>
+    </w:p>
+    <w:p>
+      <w:r>
+        <w:t>├── main.py</w:t>
+      </w:r>
+    </w:p>
+    <w:p>
+      <w:r>
+        <w:t>├── config.py</w:t>
+      </w:r>
+    </w:p>
+    <w:p>
+      <w:r>
+        <w:t>├── requirements.txt</w:t>
+      </w:r>
+    </w:p>
+    <w:p>
+      <w:r>
+        <w:t>├── .env</w:t>
+      </w:r>
+    </w:p>
+    <w:p>
+      <w:r>
+        <w:t>├── README.md</w:t>
+      </w:r>
+    </w:p>
+    <w:p>
+      <w:r>
+        <w:t>│</w:t>
+      </w:r>
+    </w:p>
+    <w:p>
+      <w:r>
+        <w:t>├── bot/</w:t>
+      </w:r>
+    </w:p>
+    <w:p>
+      <w:r>
+        <w:t>│   │</w:t>
+      </w:r>
+    </w:p>
+    <w:p>
+      <w:r>
+        <w:t>│   ├── commands/</w:t>
+      </w:r>
+    </w:p>
+    <w:p>
+      <w:r>
+        <w:t>│   │   ├── start.py</w:t>
+      </w:r>
+    </w:p>
+    <w:p>
+      <w:r>
+        <w:t>│   │   ├── profile.py</w:t>
+      </w:r>
+    </w:p>
+    <w:p>
+      <w:r>
+        <w:t>│   │   ├── battle.py</w:t>
+      </w:r>
+    </w:p>
+    <w:p>
+      <w:r>
+        <w:t>│   │   ├── inventory.py</w:t>
+      </w:r>
+    </w:p>
+    <w:p>
+      <w:r>
+        <w:t>│   │   ├── heroes.py</w:t>
+      </w:r>
+    </w:p>
+    <w:p>
+      <w:r>
+        <w:t>│   │   ├── settings.py</w:t>
+      </w:r>
+    </w:p>
+    <w:p>
+      <w:r>
+        <w:t>│   │   └── admin.py</w:t>
+      </w:r>
+    </w:p>
+    <w:p>
+      <w:r>
+        <w:t>│   │</w:t>
+      </w:r>
+    </w:p>
+    <w:p>
+      <w:r>
+        <w:t>│   ├── systems/</w:t>
+      </w:r>
+    </w:p>
+    <w:p>
+      <w:r>
+        <w:t>│   │   ├── player.py</w:t>
+      </w:r>
+    </w:p>
+    <w:p>
+      <w:r>
+        <w:t>│   │   ├── heroes.py</w:t>
+      </w:r>
+    </w:p>
+    <w:p>
+      <w:r>
+        <w:lastRenderedPageBreak/>
+        <w:t>│   │   ├── resonance.py</w:t>
+      </w:r>
+    </w:p>
+    <w:p>
+      <w:r>
+        <w:t>│   │   ├── bond.py</w:t>
+      </w:r>
+    </w:p>
+    <w:p>
+      <w:r>
+        <w:t>│   │   ├── oath.py</w:t>
+      </w:r>
+    </w:p>
+    <w:p>
+      <w:r>
+        <w:t>│   │   ├── combat.py</w:t>
+      </w:r>
+    </w:p>
+    <w:p>
+      <w:r>
+        <w:t>│   │   ├── inventory.py</w:t>
+      </w:r>
+    </w:p>
+    <w:p>
+      <w:r>
+        <w:t>│   │   ├── equipment.py</w:t>
+      </w:r>
+    </w:p>
+    <w:p>
+      <w:r>
+        <w:t>│   │   ├── rewards.py</w:t>
+      </w:r>
+    </w:p>
+    <w:p>
+      <w:r>
+        <w:t>│   │   ├── achievements.py</w:t>
+      </w:r>
+    </w:p>
+    <w:p>
+      <w:r>
+        <w:t>│   │   ├── quests.py</w:t>
+      </w:r>
+    </w:p>
+    <w:p>
+      <w:r>
+        <w:t>│   │   ├── ranking.py</w:t>
+      </w:r>
+    </w:p>
+    <w:p>
+      <w:r>
+        <w:t>│   │   └── statistics.py</w:t>
+      </w:r>
+    </w:p>
+    <w:p>
+      <w:r>
+        <w:t>│   │</w:t>
+      </w:r>
+    </w:p>
+    <w:p>
+      <w:r>
+        <w:t>│   ├── services/</w:t>
+      </w:r>
+    </w:p>
+    <w:p>
+      <w:r>
+        <w:t>│   │   ├── channel_service.py</w:t>
+      </w:r>
+    </w:p>
+    <w:p>
+      <w:r>
+        <w:t>│   │   ├── message_service.py</w:t>
+      </w:r>
+    </w:p>
+    <w:p>
+      <w:r>
+        <w:t>│   │   ├── embed_service.py</w:t>
+      </w:r>
+    </w:p>
+    <w:p>
+      <w:r>
+        <w:t>│   │   ├── image_service.py</w:t>
+      </w:r>
+    </w:p>
+    <w:p>
+      <w:r>
+        <w:t>│   │   ├── hero_service.py</w:t>
+      </w:r>
+    </w:p>
+    <w:p>
+      <w:r>
+        <w:t>│   │   └── save_service.py</w:t>
+      </w:r>
+    </w:p>
+    <w:p>
+      <w:r>
+        <w:t>│   │</w:t>
+      </w:r>
+    </w:p>
+    <w:p>
+      <w:r>
+        <w:t>│   ├── story/</w:t>
+      </w:r>
+    </w:p>
+    <w:p>
+      <w:r>
+        <w:t>│   │   ├── arrival.py</w:t>
+      </w:r>
+    </w:p>
+    <w:p>
+      <w:r>
+        <w:t>│   │   ├── prologue.py</w:t>
+      </w:r>
+    </w:p>
+    <w:p>
+      <w:r>
+        <w:lastRenderedPageBreak/>
+        <w:t>│   │   ├── soul_core.py</w:t>
+      </w:r>
+    </w:p>
+    <w:p>
+      <w:r>
+        <w:t>│   │   ├── resonance.py</w:t>
+      </w:r>
+    </w:p>
+    <w:p>
+      <w:r>
+        <w:t>│   │   ├── oath.py</w:t>
+      </w:r>
+    </w:p>
+    <w:p>
+      <w:r>
+        <w:t>│   │   ├── awakening.py</w:t>
+      </w:r>
+    </w:p>
+    <w:p>
+      <w:r>
+        <w:t>│   │   │</w:t>
+      </w:r>
+    </w:p>
+    <w:p>
+      <w:r>
+        <w:t>│   │   └── chapters/</w:t>
+      </w:r>
+    </w:p>
+    <w:p>
+      <w:r>
+        <w:t>│   │       ├── chapter_01.py</w:t>
+      </w:r>
+    </w:p>
+    <w:p>
+      <w:r>
+        <w:t>│   │       ├── chapter_02.py</w:t>
+      </w:r>
+    </w:p>
+    <w:p>
+      <w:r>
+        <w:t>│   │       └── ...</w:t>
+      </w:r>
+    </w:p>
+    <w:p>
+      <w:r>
+        <w:t>│   │</w:t>
+      </w:r>
+    </w:p>
+    <w:p>
+      <w:r>
+        <w:t>│   ├── views/</w:t>
+      </w:r>
+    </w:p>
+    <w:p>
+      <w:r>
+        <w:t>│   │   ├── arrival_view.py</w:t>
+      </w:r>
+    </w:p>
+    <w:p>
+      <w:r>
+        <w:t>│   │   ├── prologue_view.py</w:t>
+      </w:r>
+    </w:p>
+    <w:p>
+      <w:r>
+        <w:t>│   │   ├── soul_core_view.py</w:t>
+      </w:r>
+    </w:p>
+    <w:p>
+      <w:r>
+        <w:t>│   │   ├── resonance_view.py</w:t>
+      </w:r>
+    </w:p>
+    <w:p>
+      <w:r>
+        <w:t>│   │   ├── hero_selection_view.py</w:t>
+      </w:r>
+    </w:p>
+    <w:p>
+      <w:r>
+        <w:t>│   │   ├── hero_profile_view.py</w:t>
+      </w:r>
+    </w:p>
+    <w:p>
+      <w:r>
+        <w:t>│   │   ├── inventory_view.py</w:t>
+      </w:r>
+    </w:p>
+    <w:p>
+      <w:r>
+        <w:t>│   │   ├── battle_view.py</w:t>
+      </w:r>
+    </w:p>
+    <w:p>
+      <w:r>
+        <w:t>│   │   └── confirmation_view.py</w:t>
+      </w:r>
+    </w:p>
+    <w:p>
+      <w:r>
+        <w:t>│   │</w:t>
+      </w:r>
+    </w:p>
+    <w:p>
+      <w:r>
+        <w:t>│   ├── ui/</w:t>
+      </w:r>
+    </w:p>
+    <w:p>
+      <w:r>
+        <w:t>│   │   ├── buttons.py</w:t>
+      </w:r>
+    </w:p>
+    <w:p>
+      <w:r>
+        <w:lastRenderedPageBreak/>
+        <w:t>│   │   ├── dropdowns.py</w:t>
+      </w:r>
+    </w:p>
+    <w:p>
+      <w:r>
+        <w:t>│   │   ├── modals.py</w:t>
+      </w:r>
+    </w:p>
+    <w:p>
+      <w:r>
+        <w:t>│   │   └── paginator.py</w:t>
+      </w:r>
+    </w:p>
+    <w:p>
+      <w:r>
+        <w:t>│   │</w:t>
+      </w:r>
+    </w:p>
+    <w:p>
+      <w:r>
+        <w:t>│   ├── events/</w:t>
+      </w:r>
+    </w:p>
+    <w:p>
+      <w:r>
+        <w:t>│   │   ├── on_ready.py</w:t>
+      </w:r>
+    </w:p>
+    <w:p>
+      <w:r>
+        <w:t>│   │   ├── on_member_join.py</w:t>
+      </w:r>
+    </w:p>
+    <w:p>
+      <w:r>
+        <w:t>│   │   ├── on_member_remove.py</w:t>
+      </w:r>
+    </w:p>
+    <w:p>
+      <w:r>
+        <w:t>│   │   ├── on_message.py</w:t>
+      </w:r>
+    </w:p>
+    <w:p>
+      <w:r>
+        <w:t>│   │   └── on_interaction.py</w:t>
+      </w:r>
+    </w:p>
+    <w:p>
+      <w:r>
+        <w:t>│   │</w:t>
+      </w:r>
+    </w:p>
+    <w:p>
+      <w:r>
+        <w:t>│   ├── database/</w:t>
+      </w:r>
+    </w:p>
+    <w:p>
+      <w:r>
+        <w:t>│   │   ├── database.py</w:t>
+      </w:r>
+    </w:p>
+    <w:p>
+      <w:r>
+        <w:t>│   │   ├── models.py</w:t>
+      </w:r>
+    </w:p>
+    <w:p>
+      <w:r>
+        <w:t>│   │   │</w:t>
+      </w:r>
+    </w:p>
+    <w:p>
+      <w:r>
+        <w:t>│   │   └── repositories/</w:t>
+      </w:r>
+    </w:p>
+    <w:p>
+      <w:r>
+        <w:t>│   │       ├── player_repository.py</w:t>
+      </w:r>
+    </w:p>
+    <w:p>
+      <w:r>
+        <w:t>│   │       ├── hero_repository.py</w:t>
+      </w:r>
+    </w:p>
+    <w:p>
+      <w:r>
+        <w:t>│   │       ├── bond_repository.py</w:t>
+      </w:r>
+    </w:p>
+    <w:p>
+      <w:r>
+        <w:t>│   │       ├── inventory_repository.py</w:t>
+      </w:r>
+    </w:p>
+    <w:p>
+      <w:r>
+        <w:t>│   │       ├── quest_repository.py</w:t>
+      </w:r>
+    </w:p>
+    <w:p>
+      <w:r>
+        <w:t>│   │       ├── achievement_repository.py</w:t>
+      </w:r>
+    </w:p>
+    <w:p>
+      <w:r>
+        <w:t>│   │       └── statistics_repository.py</w:t>
+      </w:r>
+    </w:p>
+    <w:p>
+      <w:r>
+        <w:lastRenderedPageBreak/>
+        <w:t>│   │</w:t>
+      </w:r>
+    </w:p>
+    <w:p>
+      <w:r>
+        <w:t>│   ├── utils/</w:t>
+      </w:r>
+    </w:p>
+    <w:p>
+      <w:r>
+        <w:t>│   │   ├── constants.py</w:t>
+      </w:r>
+    </w:p>
+    <w:p>
+      <w:r>
+        <w:t>│   │   ├── logger.py</w:t>
+      </w:r>
+    </w:p>
+    <w:p>
+      <w:r>
+        <w:t>│   │   ├── formatter.py</w:t>
+      </w:r>
+    </w:p>
+    <w:p>
+      <w:r>
+        <w:t>│   │   ├── helper.py</w:t>
+      </w:r>
+    </w:p>
+    <w:p>
+      <w:r>
+        <w:t>│   │   └── validator.py</w:t>
+      </w:r>
+    </w:p>
+    <w:p>
+      <w:r>
+        <w:t>│   │</w:t>
+      </w:r>
+    </w:p>
+    <w:p>
+      <w:r>
+        <w:t>│   └── __init__.py</w:t>
+      </w:r>
+    </w:p>
+    <w:p>
+      <w:r>
+        <w:t>│</w:t>
+      </w:r>
+    </w:p>
+    <w:p>
+      <w:r>
+        <w:t>├── data/</w:t>
+      </w:r>
+    </w:p>
+    <w:p>
+      <w:r>
+        <w:t>│   │</w:t>
+      </w:r>
+    </w:p>
+    <w:p>
+      <w:r>
+        <w:t>│   ├── heroes.json</w:t>
+      </w:r>
+    </w:p>
+    <w:p>
+      <w:r>
+        <w:t>│   ├── items.json</w:t>
+      </w:r>
+    </w:p>
+    <w:p>
+      <w:r>
+        <w:t>│   ├── equipment.json</w:t>
+      </w:r>
+    </w:p>
+    <w:p>
+      <w:r>
+        <w:t>│   ├── enemies.json</w:t>
+      </w:r>
+    </w:p>
+    <w:p>
+      <w:r>
+        <w:t>│   ├── skills.json</w:t>
+      </w:r>
+    </w:p>
+    <w:p>
+      <w:r>
+        <w:t>│   ├── achievements.json</w:t>
+      </w:r>
+    </w:p>
+    <w:p>
+      <w:r>
+        <w:t>│   ├── titles.json</w:t>
+      </w:r>
+    </w:p>
+    <w:p>
+      <w:r>
+        <w:t>│   ├── factions.json</w:t>
+      </w:r>
+    </w:p>
+    <w:p>
+      <w:r>
+        <w:t>│   ├── dialogue.json</w:t>
+      </w:r>
+    </w:p>
+    <w:p>
+      <w:r>
+        <w:t>│   ├── quests.json</w:t>
+      </w:r>
+    </w:p>
+    <w:p>
+      <w:r>
+        <w:t>│   └── world.json</w:t>
+      </w:r>
+    </w:p>
+    <w:p>
+      <w:r>
+        <w:lastRenderedPageBreak/>
+        <w:t>│</w:t>
+      </w:r>
+    </w:p>
+    <w:p>
+      <w:r>
+        <w:t>├── assets/</w:t>
+      </w:r>
+    </w:p>
+    <w:p>
+      <w:r>
+        <w:t>│   │</w:t>
+      </w:r>
+    </w:p>
+    <w:p>
+      <w:r>
+        <w:t>│   ├── heroes/</w:t>
+      </w:r>
+    </w:p>
+    <w:p>
+      <w:r>
+        <w:t>│   ├── enemies/</w:t>
+      </w:r>
+    </w:p>
+    <w:p>
+      <w:r>
+        <w:t>│   ├── icons/</w:t>
+      </w:r>
+    </w:p>
+    <w:p>
+      <w:r>
+        <w:t>│   ├── ui/</w:t>
+      </w:r>
+    </w:p>
+    <w:p>
+      <w:r>
+        <w:t>│   ├── backgrounds/</w:t>
+      </w:r>
+    </w:p>
+    <w:p>
+      <w:r>
+        <w:t>│   └── banners/</w:t>
+      </w:r>
+    </w:p>
+    <w:p>
+      <w:r>
+        <w:t>│</w:t>
+      </w:r>
+    </w:p>
+    <w:p>
+      <w:r>
+        <w:t>├── logs/</w:t>
+      </w:r>
+    </w:p>
+    <w:p>
+      <w:r>
+        <w:t>│   └── bot.log</w:t>
+      </w:r>
+    </w:p>
+    <w:p>
+      <w:r>
+        <w:t>│</w:t>
+      </w:r>
+    </w:p>
+    <w:p>
+      <w:r>
+        <w:t>└── tests/</w:t>
+      </w:r>
+    </w:p>
+    <w:p>
+      <w:r>
+        <w:t xml:space="preserve">    ├── test_bond.py</w:t>
+      </w:r>
+    </w:p>
+    <w:p>
+      <w:r>
+        <w:t xml:space="preserve">    ├── test_combat.py</w:t>
+      </w:r>
+    </w:p>
+    <w:p>
+      <w:r>
+        <w:t xml:space="preserve">    ├── test_database.py</w:t>
+      </w:r>
+    </w:p>
+    <w:p>
+      <w:r>
+        <w:t xml:space="preserve">    └── test_resonance.py</w:t>
+      </w:r>
+    </w:p>
+    <w:p>
+      <w:pPr>
+        <w:spacing w:line="278" w:lineRule="auto"/>
+        <w:jc w:val="left"/>
+      </w:pPr>
+      <w:r>
+        <w:br w:type="page"/>
+      </w:r>
+    </w:p>
+    <w:tbl>
+      <w:tblPr>
+        <w:tblW w:w="0" w:type="auto"/>
+        <w:tblCellSpacing w:w="15" w:type="dxa"/>
+        <w:tblCellMar>
+          <w:top w:w="15" w:type="dxa"/>
+          <w:left w:w="15" w:type="dxa"/>
+          <w:bottom w:w="15" w:type="dxa"/>
+          <w:right w:w="15" w:type="dxa"/>
+        </w:tblCellMar>
+        <w:tblLook w:val="04A0" w:firstRow="1" w:lastRow="0" w:firstColumn="1" w:lastColumn="0" w:noHBand="0" w:noVBand="1"/>
+      </w:tblPr>
+      <w:tblGrid>
+        <w:gridCol w:w="1249"/>
+        <w:gridCol w:w="4944"/>
+      </w:tblGrid>
+      <w:tr>
+        <w:trPr>
+          <w:tblHeader/>
+          <w:tblCellSpacing w:w="15" w:type="dxa"/>
+        </w:trPr>
+        <w:tc>
+          <w:tcPr>
+            <w:tcW w:w="0" w:type="auto"/>
+            <w:vAlign w:val="center"/>
+            <w:hideMark/>
+          </w:tcPr>
+          <w:p>
+            <w:pPr>
+              <w:rPr>
+                <w:b/>
+                <w:bCs/>
+              </w:rPr>
+            </w:pPr>
+            <w:r>
+              <w:rPr>
+                <w:b/>
+                <w:bCs/>
+              </w:rPr>
+              <w:lastRenderedPageBreak/>
+              <w:t>Folder</w:t>
+            </w:r>
+          </w:p>
+        </w:tc>
+        <w:tc>
+          <w:tcPr>
+            <w:tcW w:w="0" w:type="auto"/>
+            <w:vAlign w:val="center"/>
+            <w:hideMark/>
+          </w:tcPr>
+          <w:p>
+            <w:pPr>
+              <w:rPr>
+                <w:b/>
+                <w:bCs/>
+              </w:rPr>
+            </w:pPr>
+            <w:r>
+              <w:rPr>
+                <w:b/>
+                <w:bCs/>
+              </w:rPr>
+              <w:t>Responsibility</w:t>
+            </w:r>
+          </w:p>
+        </w:tc>
+      </w:tr>
+      <w:tr>
+        <w:trPr>
+          <w:tblCellSpacing w:w="15" w:type="dxa"/>
+        </w:trPr>
+        <w:tc>
+          <w:tcPr>
+            <w:tcW w:w="0" w:type="auto"/>
+            <w:vAlign w:val="center"/>
+            <w:hideMark/>
+          </w:tcPr>
+          <w:p>
+            <w:r>
+              <w:t>commands</w:t>
+            </w:r>
+          </w:p>
+        </w:tc>
+        <w:tc>
+          <w:tcPr>
+            <w:tcW w:w="0" w:type="auto"/>
+            <w:vAlign w:val="center"/>
+            <w:hideMark/>
+          </w:tcPr>
+          <w:p>
+            <w:r>
+              <w:t>What can the player type?</w:t>
+            </w:r>
+          </w:p>
+        </w:tc>
+      </w:tr>
+      <w:tr>
+        <w:trPr>
+          <w:tblCellSpacing w:w="15" w:type="dxa"/>
+        </w:trPr>
+        <w:tc>
+          <w:tcPr>
+            <w:tcW w:w="0" w:type="auto"/>
+            <w:vAlign w:val="center"/>
+            <w:hideMark/>
+          </w:tcPr>
+          <w:p>
+            <w:r>
+              <w:t>views</w:t>
+            </w:r>
+          </w:p>
+        </w:tc>
+        <w:tc>
+          <w:tcPr>
+            <w:tcW w:w="0" w:type="auto"/>
+            <w:vAlign w:val="center"/>
+            <w:hideMark/>
+          </w:tcPr>
+          <w:p>
+            <w:r>
+              <w:t>What can the player click?</w:t>
+            </w:r>
+          </w:p>
+        </w:tc>
+      </w:tr>
+      <w:tr>
+        <w:trPr>
+          <w:tblCellSpacing w:w="15" w:type="dxa"/>
+        </w:trPr>
+        <w:tc>
+          <w:tcPr>
+            <w:tcW w:w="0" w:type="auto"/>
+            <w:vAlign w:val="center"/>
+            <w:hideMark/>
+          </w:tcPr>
+          <w:p>
+            <w:r>
+              <w:t>story</w:t>
+            </w:r>
+          </w:p>
+        </w:tc>
+        <w:tc>
+          <w:tcPr>
+            <w:tcW w:w="0" w:type="auto"/>
+            <w:vAlign w:val="center"/>
+            <w:hideMark/>
+          </w:tcPr>
+          <w:p>
+            <w:r>
+              <w:t>What is happening in the world?</w:t>
+            </w:r>
+          </w:p>
+        </w:tc>
+      </w:tr>
+      <w:tr>
+        <w:trPr>
+          <w:tblCellSpacing w:w="15" w:type="dxa"/>
+        </w:trPr>
+        <w:tc>
+          <w:tcPr>
+            <w:tcW w:w="0" w:type="auto"/>
+            <w:vAlign w:val="center"/>
+            <w:hideMark/>
+          </w:tcPr>
+          <w:p>
+            <w:r>
+              <w:t>systems</w:t>
+            </w:r>
+          </w:p>
+        </w:tc>
+        <w:tc>
+          <w:tcPr>
+            <w:tcW w:w="0" w:type="auto"/>
+            <w:vAlign w:val="center"/>
+            <w:hideMark/>
+          </w:tcPr>
+          <w:p>
+            <w:r>
+              <w:t>How does the game work?</w:t>
+            </w:r>
+          </w:p>
+        </w:tc>
+      </w:tr>
+      <w:tr>
+        <w:trPr>
+          <w:tblCellSpacing w:w="15" w:type="dxa"/>
+        </w:trPr>
+        <w:tc>
+          <w:tcPr>
+            <w:tcW w:w="0" w:type="auto"/>
+            <w:vAlign w:val="center"/>
+            <w:hideMark/>
+          </w:tcPr>
+          <w:p>
+            <w:r>
+              <w:t>services</w:t>
+            </w:r>
+          </w:p>
+        </w:tc>
+        <w:tc>
+          <w:tcPr>
+            <w:tcW w:w="0" w:type="auto"/>
+            <w:vAlign w:val="center"/>
+            <w:hideMark/>
+          </w:tcPr>
+          <w:p>
+            <w:r>
+              <w:t>How does the bot communicate with Discord?</w:t>
+            </w:r>
+          </w:p>
+        </w:tc>
+      </w:tr>
+      <w:tr>
+        <w:trPr>
+          <w:tblCellSpacing w:w="15" w:type="dxa"/>
+        </w:trPr>
+        <w:tc>
+          <w:tcPr>
+            <w:tcW w:w="0" w:type="auto"/>
+            <w:vAlign w:val="center"/>
+            <w:hideMark/>
+          </w:tcPr>
+          <w:p>
+            <w:r>
+              <w:t>database</w:t>
+            </w:r>
+          </w:p>
+        </w:tc>
+        <w:tc>
+          <w:tcPr>
+            <w:tcW w:w="0" w:type="auto"/>
+            <w:vAlign w:val="center"/>
+            <w:hideMark/>
+          </w:tcPr>
+          <w:p>
+            <w:r>
+              <w:t>What is permanently saved?</w:t>
+            </w:r>
+          </w:p>
+        </w:tc>
+      </w:tr>
+      <w:tr>
+        <w:trPr>
+          <w:tblCellSpacing w:w="15" w:type="dxa"/>
+        </w:trPr>
+        <w:tc>
+          <w:tcPr>
+            <w:tcW w:w="0" w:type="auto"/>
+            <w:vAlign w:val="center"/>
+            <w:hideMark/>
+          </w:tcPr>
+          <w:p>
+            <w:r>
+              <w:t>data</w:t>
+            </w:r>
+          </w:p>
+        </w:tc>
+        <w:tc>
+          <w:tcPr>
+            <w:tcW w:w="0" w:type="auto"/>
+            <w:vAlign w:val="center"/>
+            <w:hideMark/>
+          </w:tcPr>
+          <w:p>
+            <w:r>
+              <w:t>What content exists in the world?</w:t>
+            </w:r>
+          </w:p>
+        </w:tc>
+      </w:tr>
+      <w:tr>
+        <w:trPr>
+          <w:tblCellSpacing w:w="15" w:type="dxa"/>
+        </w:trPr>
+        <w:tc>
+          <w:tcPr>
+            <w:tcW w:w="0" w:type="auto"/>
+            <w:vAlign w:val="center"/>
+            <w:hideMark/>
+          </w:tcPr>
+          <w:p>
+            <w:r>
+              <w:t>assets</w:t>
+            </w:r>
+          </w:p>
+        </w:tc>
+        <w:tc>
+          <w:tcPr>
+            <w:tcW w:w="0" w:type="auto"/>
+            <w:vAlign w:val="center"/>
+            <w:hideMark/>
+          </w:tcPr>
+          <w:p>
+            <w:r>
+              <w:t>What visual resources exist?</w:t>
+            </w:r>
+          </w:p>
+        </w:tc>
+      </w:tr>
+      <w:tr>
+        <w:trPr>
+          <w:tblCellSpacing w:w="15" w:type="dxa"/>
+        </w:trPr>
+        <w:tc>
+          <w:tcPr>
+            <w:tcW w:w="0" w:type="auto"/>
+            <w:vAlign w:val="center"/>
+            <w:hideMark/>
+          </w:tcPr>
+          <w:p>
+            <w:r>
+              <w:t>utils</w:t>
+            </w:r>
+          </w:p>
+        </w:tc>
+        <w:tc>
+          <w:tcPr>
+            <w:tcW w:w="0" w:type="auto"/>
+            <w:vAlign w:val="center"/>
+            <w:hideMark/>
+          </w:tcPr>
+          <w:p>
+            <w:r>
+              <w:t>Shared helper code</w:t>
+            </w:r>
+          </w:p>
+        </w:tc>
+      </w:tr>
+    </w:tbl>
     <w:p/>
     <w:sectPr>
       <w:pgSz w:w="12240" w:h="15840"/>

</xml_diff>

<commit_message>
refactored all phase 1
</commit_message>
<xml_diff>
--- a/Soul Hero.docx
+++ b/Soul Hero.docx
@@ -1,6 +1,6 @@
 
 <file path=word/document.xml><?xml version="1.0" encoding="utf-8"?>
-<w:document xmlns:wpc="http://schemas.microsoft.com/office/word/2010/wordprocessingCanvas" xmlns:cx="http://schemas.microsoft.com/office/drawing/2014/chartex" xmlns:cx1="http://schemas.microsoft.com/office/drawing/2015/9/8/chartex" xmlns:cx2="http://schemas.microsoft.com/office/drawing/2015/10/21/chartex" xmlns:cx3="http://schemas.microsoft.com/office/drawing/2016/5/9/chartex" xmlns:cx4="http://schemas.microsoft.com/office/drawing/2016/5/10/chartex" xmlns:cx5="http://schemas.microsoft.com/office/drawing/2016/5/11/chartex" xmlns:cx6="http://schemas.microsoft.com/office/drawing/2016/5/12/chartex" xmlns:cx7="http://schemas.microsoft.com/office/drawing/2016/5/13/chartex" xmlns:cx8="http://schemas.microsoft.com/office/drawing/2016/5/14/chartex" xmlns:mc="http://schemas.openxmlformats.org/markup-compatibility/2006" xmlns:aink="http://schemas.microsoft.com/office/drawing/2016/ink" xmlns:am3d="http://schemas.microsoft.com/office/drawing/2017/model3d" xmlns:o="urn:schemas-microsoft-com:office:office" xmlns:oel="http://schemas.microsoft.com/office/2019/extlst" xmlns:r="http://schemas.openxmlformats.org/officeDocument/2006/relationships" xmlns:m="http://schemas.openxmlformats.org/officeDocument/2006/math" xmlns:v="urn:schemas-microsoft-com:vml" xmlns:wp14="http://schemas.microsoft.com/office/word/2010/wordprocessingDrawing" xmlns:wp="http://schemas.openxmlformats.org/drawingml/2006/wordprocessingDrawing" xmlns:w10="urn:schemas-microsoft-com:office:word" xmlns:w="http://schemas.openxmlformats.org/wordprocessingml/2006/main" xmlns:w14="http://schemas.microsoft.com/office/word/2010/wordml" xmlns:w15="http://schemas.microsoft.com/office/word/2012/wordml" xmlns:w16cex="http://schemas.microsoft.com/office/word/2018/wordml/cex" xmlns:w16cid="http://schemas.microsoft.com/office/word/2016/wordml/cid" xmlns:w16="http://schemas.microsoft.com/office/word/2018/wordml" xmlns:w16du="http://schemas.microsoft.com/office/word/2023/wordml/word16du" xmlns:w16sdtdh="http://schemas.microsoft.com/office/word/2020/wordml/sdtdatahash" xmlns:w16sdtfl="http://schemas.microsoft.com/office/word/2024/wordml/sdtformatlock" xmlns:w16se="http://schemas.microsoft.com/office/word/2015/wordml/symex" xmlns:wpg="http://schemas.microsoft.com/office/word/2010/wordprocessingGroup" xmlns:wpi="http://schemas.microsoft.com/office/word/2010/wordprocessingInk" xmlns:wne="http://schemas.microsoft.com/office/word/2006/wordml" xmlns:wps="http://schemas.microsoft.com/office/word/2010/wordprocessingShape" mc:Ignorable="w14 w15 w16se w16cid w16 w16cex w16sdtdh w16sdtfl w16du wp14">
+<w:document xmlns:wpc="http://schemas.microsoft.com/office/word/2010/wordprocessingCanvas" xmlns:cx="http://schemas.microsoft.com/office/drawing/2014/chartex" xmlns:cx1="http://schemas.microsoft.com/office/drawing/2015/9/8/chartex" xmlns:cx2="http://schemas.microsoft.com/office/drawing/2015/10/21/chartex" xmlns:cx3="http://schemas.microsoft.com/office/drawing/2016/5/9/chartex" xmlns:cx4="http://schemas.microsoft.com/office/drawing/2016/5/10/chartex" xmlns:cx5="http://schemas.microsoft.com/office/drawing/2016/5/11/chartex" xmlns:cx6="http://schemas.microsoft.com/office/drawing/2016/5/12/chartex" xmlns:cx7="http://schemas.microsoft.com/office/drawing/2016/5/13/chartex" xmlns:cx8="http://schemas.microsoft.com/office/drawing/2016/5/14/chartex" xmlns:mc="http://schemas.openxmlformats.org/markup-compatibility/2006" xmlns:aink="http://schemas.microsoft.com/office/drawing/2016/ink" xmlns:am3d="http://schemas.microsoft.com/office/drawing/2017/model3d" xmlns:o="urn:schemas-microsoft-com:office:office" xmlns:oel="http://schemas.microsoft.com/office/2019/extlst" xmlns:r="http://schemas.openxmlformats.org/officeDocument/2006/relationships" xmlns:m="http://schemas.openxmlformats.org/officeDocument/2006/math" xmlns:v="urn:schemas-microsoft-com:vml" xmlns:wp14="http://schemas.microsoft.com/office/word/2010/wordprocessingDrawing" xmlns:wp="http://schemas.openxmlformats.org/drawingml/2006/wordprocessingDrawing" xmlns:w10="urn:schemas-microsoft-com:office:word" xmlns:w="http://schemas.openxmlformats.org/wordprocessingml/2006/main" xmlns:w14="http://schemas.microsoft.com/office/word/2010/wordml" xmlns:w15="http://schemas.microsoft.com/office/word/2012/wordml" xmlns:w16cei="http://schemas.microsoft.com/office/word/2026/wordml/cei" xmlns:w16cex="http://schemas.microsoft.com/office/word/2018/wordml/cex" xmlns:w16cid="http://schemas.microsoft.com/office/word/2016/wordml/cid" xmlns:w16="http://schemas.microsoft.com/office/word/2018/wordml" xmlns:w16du="http://schemas.microsoft.com/office/word/2023/wordml/word16du" xmlns:w16sdtdh="http://schemas.microsoft.com/office/word/2020/wordml/sdtdatahash" xmlns:w16sdtfl="http://schemas.microsoft.com/office/word/2024/wordml/sdtformatlock" xmlns:w16se="http://schemas.microsoft.com/office/word/2015/wordml/symex" xmlns:wpg="http://schemas.microsoft.com/office/word/2010/wordprocessingGroup" xmlns:wpi="http://schemas.microsoft.com/office/word/2010/wordprocessingInk" xmlns:wne="http://schemas.microsoft.com/office/word/2006/wordml" xmlns:wps="http://schemas.microsoft.com/office/word/2010/wordprocessingShape" mc:Ignorable="w14 w15 w16se w16cid w16 w16cex w16sdtdh w16sdtfl w16du wp14">
   <w:body>
     <w:p>
       <w:pPr>
@@ -9187,7 +9187,7 @@
     <w:p>
       <w:r>
         <w:pict w14:anchorId="7E105D7E">
-          <v:rect id="_x0000_i1141" style="width:0;height:1.5pt" o:hralign="center" o:hrstd="t" o:hr="t" fillcolor="#a0a0a0" stroked="f"/>
+          <v:rect id="_x0000_i1093" style="width:0;height:1.5pt" o:hralign="center" o:hrstd="t" o:hr="t" fillcolor="#a0a0a0" stroked="f"/>
         </w:pict>
       </w:r>
     </w:p>
@@ -9243,7 +9243,7 @@
     <w:p>
       <w:r>
         <w:pict w14:anchorId="54DF9938">
-          <v:rect id="_x0000_i1142" style="width:0;height:1.5pt" o:hralign="center" o:hrstd="t" o:hr="t" fillcolor="#a0a0a0" stroked="f"/>
+          <v:rect id="_x0000_i1094" style="width:0;height:1.5pt" o:hralign="center" o:hrstd="t" o:hr="t" fillcolor="#a0a0a0" stroked="f"/>
         </w:pict>
       </w:r>
     </w:p>
@@ -9296,7 +9296,7 @@
     <w:p>
       <w:r>
         <w:pict w14:anchorId="2105C94B">
-          <v:rect id="_x0000_i1143" style="width:0;height:1.5pt" o:hralign="center" o:hrstd="t" o:hr="t" fillcolor="#a0a0a0" stroked="f"/>
+          <v:rect id="_x0000_i1095" style="width:0;height:1.5pt" o:hralign="center" o:hrstd="t" o:hr="t" fillcolor="#a0a0a0" stroked="f"/>
         </w:pict>
       </w:r>
     </w:p>
@@ -9352,7 +9352,7 @@
     <w:p>
       <w:r>
         <w:pict w14:anchorId="760814D0">
-          <v:rect id="_x0000_i1144" style="width:0;height:1.5pt" o:hralign="center" o:hrstd="t" o:hr="t" fillcolor="#a0a0a0" stroked="f"/>
+          <v:rect id="_x0000_i1096" style="width:0;height:1.5pt" o:hralign="center" o:hrstd="t" o:hr="t" fillcolor="#a0a0a0" stroked="f"/>
         </w:pict>
       </w:r>
     </w:p>
@@ -9417,7 +9417,7 @@
     <w:p>
       <w:r>
         <w:pict w14:anchorId="2F137636">
-          <v:rect id="_x0000_i1145" style="width:0;height:1.5pt" o:hralign="center" o:hrstd="t" o:hr="t" fillcolor="#a0a0a0" stroked="f"/>
+          <v:rect id="_x0000_i1097" style="width:0;height:1.5pt" o:hralign="center" o:hrstd="t" o:hr="t" fillcolor="#a0a0a0" stroked="f"/>
         </w:pict>
       </w:r>
     </w:p>
@@ -9481,7 +9481,7 @@
     <w:p>
       <w:r>
         <w:pict w14:anchorId="18AAB8D5">
-          <v:rect id="_x0000_i1146" style="width:0;height:1.5pt" o:hralign="center" o:hrstd="t" o:hr="t" fillcolor="#a0a0a0" stroked="f"/>
+          <v:rect id="_x0000_i1098" style="width:0;height:1.5pt" o:hralign="center" o:hrstd="t" o:hr="t" fillcolor="#a0a0a0" stroked="f"/>
         </w:pict>
       </w:r>
     </w:p>
@@ -9525,7 +9525,7 @@
     <w:p>
       <w:r>
         <w:pict w14:anchorId="6881743B">
-          <v:rect id="_x0000_i1147" style="width:0;height:1.5pt" o:hralign="center" o:hrstd="t" o:hr="t" fillcolor="#a0a0a0" stroked="f"/>
+          <v:rect id="_x0000_i1099" style="width:0;height:1.5pt" o:hralign="center" o:hrstd="t" o:hr="t" fillcolor="#a0a0a0" stroked="f"/>
         </w:pict>
       </w:r>
     </w:p>
@@ -9690,7 +9690,7 @@
       <w:r>
         <w:lastRenderedPageBreak/>
         <w:pict w14:anchorId="4954E5C2">
-          <v:rect id="_x0000_i1148" style="width:0;height:1.5pt" o:hralign="center" o:hrstd="t" o:hr="t" fillcolor="#a0a0a0" stroked="f"/>
+          <v:rect id="_x0000_i1100" style="width:0;height:1.5pt" o:hralign="center" o:hrstd="t" o:hr="t" fillcolor="#a0a0a0" stroked="f"/>
         </w:pict>
       </w:r>
     </w:p>
@@ -9852,7 +9852,7 @@
     <w:p>
       <w:r>
         <w:pict w14:anchorId="6869523B">
-          <v:rect id="_x0000_i1223" style="width:0;height:1.5pt" o:hralign="center" o:hrstd="t" o:hr="t" fillcolor="#a0a0a0" stroked="f"/>
+          <v:rect id="_x0000_i1101" style="width:0;height:1.5pt" o:hralign="center" o:hrstd="t" o:hr="t" fillcolor="#a0a0a0" stroked="f"/>
         </w:pict>
       </w:r>
     </w:p>
@@ -9930,7 +9930,7 @@
     <w:p>
       <w:r>
         <w:pict w14:anchorId="2B8492A7">
-          <v:rect id="_x0000_i1224" style="width:0;height:1.5pt" o:hralign="center" o:hrstd="t" o:hr="t" fillcolor="#a0a0a0" stroked="f"/>
+          <v:rect id="_x0000_i1102" style="width:0;height:1.5pt" o:hralign="center" o:hrstd="t" o:hr="t" fillcolor="#a0a0a0" stroked="f"/>
         </w:pict>
       </w:r>
     </w:p>
@@ -10039,7 +10039,7 @@
     <w:p>
       <w:r>
         <w:pict w14:anchorId="17FAD5C1">
-          <v:rect id="_x0000_i1225" style="width:0;height:1.5pt" o:hralign="center" o:hrstd="t" o:hr="t" fillcolor="#a0a0a0" stroked="f"/>
+          <v:rect id="_x0000_i1103" style="width:0;height:1.5pt" o:hralign="center" o:hrstd="t" o:hr="t" fillcolor="#a0a0a0" stroked="f"/>
         </w:pict>
       </w:r>
     </w:p>
@@ -10131,7 +10131,7 @@
     <w:p>
       <w:r>
         <w:pict w14:anchorId="0CE712BA">
-          <v:rect id="_x0000_i1226" style="width:0;height:1.5pt" o:hralign="center" o:hrstd="t" o:hr="t" fillcolor="#a0a0a0" stroked="f"/>
+          <v:rect id="_x0000_i1104" style="width:0;height:1.5pt" o:hralign="center" o:hrstd="t" o:hr="t" fillcolor="#a0a0a0" stroked="f"/>
         </w:pict>
       </w:r>
     </w:p>
@@ -10192,7 +10192,7 @@
     <w:p>
       <w:r>
         <w:pict w14:anchorId="17C6133C">
-          <v:rect id="_x0000_i1227" style="width:0;height:1.5pt" o:hralign="center" o:hrstd="t" o:hr="t" fillcolor="#a0a0a0" stroked="f"/>
+          <v:rect id="_x0000_i1105" style="width:0;height:1.5pt" o:hralign="center" o:hrstd="t" o:hr="t" fillcolor="#a0a0a0" stroked="f"/>
         </w:pict>
       </w:r>
     </w:p>
@@ -10231,7 +10231,7 @@
     <w:p>
       <w:r>
         <w:pict w14:anchorId="24DC97FA">
-          <v:rect id="_x0000_i1228" style="width:0;height:1.5pt" o:hralign="center" o:hrstd="t" o:hr="t" fillcolor="#a0a0a0" stroked="f"/>
+          <v:rect id="_x0000_i1106" style="width:0;height:1.5pt" o:hralign="center" o:hrstd="t" o:hr="t" fillcolor="#a0a0a0" stroked="f"/>
         </w:pict>
       </w:r>
     </w:p>
@@ -10339,7 +10339,7 @@
     <w:p>
       <w:r>
         <w:pict w14:anchorId="3DBF079F">
-          <v:rect id="_x0000_i1229" style="width:0;height:1.5pt" o:hralign="center" o:hrstd="t" o:hr="t" fillcolor="#a0a0a0" stroked="f"/>
+          <v:rect id="_x0000_i1107" style="width:0;height:1.5pt" o:hralign="center" o:hrstd="t" o:hr="t" fillcolor="#a0a0a0" stroked="f"/>
         </w:pict>
       </w:r>
     </w:p>
@@ -10467,7 +10467,7 @@
     <w:p>
       <w:r>
         <w:pict w14:anchorId="64942245">
-          <v:rect id="_x0000_i1230" style="width:0;height:1.5pt" o:hralign="center" o:hrstd="t" o:hr="t" fillcolor="#a0a0a0" stroked="f"/>
+          <v:rect id="_x0000_i1108" style="width:0;height:1.5pt" o:hralign="center" o:hrstd="t" o:hr="t" fillcolor="#a0a0a0" stroked="f"/>
         </w:pict>
       </w:r>
     </w:p>
@@ -10567,7 +10567,7 @@
     <w:p>
       <w:r>
         <w:pict w14:anchorId="21F3A429">
-          <v:rect id="_x0000_i1231" style="width:0;height:1.5pt" o:hralign="center" o:hrstd="t" o:hr="t" fillcolor="#a0a0a0" stroked="f"/>
+          <v:rect id="_x0000_i1109" style="width:0;height:1.5pt" o:hralign="center" o:hrstd="t" o:hr="t" fillcolor="#a0a0a0" stroked="f"/>
         </w:pict>
       </w:r>
     </w:p>
@@ -10669,7 +10669,7 @@
     <w:p>
       <w:r>
         <w:pict w14:anchorId="1AED6C5F">
-          <v:rect id="_x0000_i1232" style="width:0;height:1.5pt" o:hralign="center" o:hrstd="t" o:hr="t" fillcolor="#a0a0a0" stroked="f"/>
+          <v:rect id="_x0000_i1110" style="width:0;height:1.5pt" o:hralign="center" o:hrstd="t" o:hr="t" fillcolor="#a0a0a0" stroked="f"/>
         </w:pict>
       </w:r>
     </w:p>
@@ -10750,7 +10750,7 @@
     <w:p>
       <w:r>
         <w:pict w14:anchorId="21634A30">
-          <v:rect id="_x0000_i1233" style="width:0;height:1.5pt" o:hralign="center" o:hrstd="t" o:hr="t" fillcolor="#a0a0a0" stroked="f"/>
+          <v:rect id="_x0000_i1111" style="width:0;height:1.5pt" o:hralign="center" o:hrstd="t" o:hr="t" fillcolor="#a0a0a0" stroked="f"/>
         </w:pict>
       </w:r>
     </w:p>
@@ -11144,6 +11144,337 @@
       <w:r>
         <w:t>30 July 2026</w:t>
       </w:r>
+    </w:p>
+    <w:p/>
+    <w:p>
+      <w:r>
+        <w:t>Player Clicks Button</w:t>
+      </w:r>
+    </w:p>
+    <w:p>
+      <w:r>
+        <w:t xml:space="preserve">        │</w:t>
+      </w:r>
+    </w:p>
+    <w:p>
+      <w:r>
+        <w:t xml:space="preserve">        ▼</w:t>
+      </w:r>
+    </w:p>
+    <w:p>
+      <w:proofErr w:type="spellStart"/>
+      <w:r>
+        <w:t>BattleView</w:t>
+      </w:r>
+      <w:proofErr w:type="spellEnd"/>
+    </w:p>
+    <w:p>
+      <w:r>
+        <w:t xml:space="preserve">        │</w:t>
+      </w:r>
+    </w:p>
+    <w:p>
+      <w:r>
+        <w:t xml:space="preserve">        ▼</w:t>
+      </w:r>
+    </w:p>
+    <w:p>
+      <w:proofErr w:type="spellStart"/>
+      <w:r>
+        <w:t>BattleAction</w:t>
+      </w:r>
+      <w:proofErr w:type="spellEnd"/>
+    </w:p>
+    <w:p>
+      <w:r>
+        <w:t xml:space="preserve">        │</w:t>
+      </w:r>
+    </w:p>
+    <w:p>
+      <w:r>
+        <w:t xml:space="preserve">        ▼</w:t>
+      </w:r>
+    </w:p>
+    <w:p>
+      <w:proofErr w:type="spellStart"/>
+      <w:r>
+        <w:t>DamageService</w:t>
+      </w:r>
+      <w:proofErr w:type="spellEnd"/>
+    </w:p>
+    <w:p>
+      <w:r>
+        <w:t xml:space="preserve">        │</w:t>
+      </w:r>
+    </w:p>
+    <w:p>
+      <w:r>
+        <w:t xml:space="preserve">        ├── </w:t>
+      </w:r>
+      <w:proofErr w:type="spellStart"/>
+      <w:r>
+        <w:t>CriticalService</w:t>
+      </w:r>
+      <w:proofErr w:type="spellEnd"/>
+    </w:p>
+    <w:p>
+      <w:r>
+        <w:t xml:space="preserve">        │</w:t>
+      </w:r>
+    </w:p>
+    <w:p>
+      <w:r>
+        <w:t xml:space="preserve">        ├── </w:t>
+      </w:r>
+      <w:proofErr w:type="spellStart"/>
+      <w:r>
+        <w:t>GuardService</w:t>
+      </w:r>
+      <w:proofErr w:type="spellEnd"/>
+    </w:p>
+    <w:p>
+      <w:r>
+        <w:t xml:space="preserve">        │</w:t>
+      </w:r>
+    </w:p>
+    <w:p>
+      <w:r>
+        <w:t xml:space="preserve">        ├── </w:t>
+      </w:r>
+      <w:proofErr w:type="spellStart"/>
+      <w:r>
+        <w:t>ForgottenSkillService</w:t>
+      </w:r>
+      <w:proofErr w:type="spellEnd"/>
+    </w:p>
+    <w:p>
+      <w:r>
+        <w:lastRenderedPageBreak/>
+        <w:t xml:space="preserve">        │</w:t>
+      </w:r>
+    </w:p>
+    <w:p>
+      <w:r>
+        <w:t xml:space="preserve">        └── Future </w:t>
+      </w:r>
+      <w:proofErr w:type="spellStart"/>
+      <w:r>
+        <w:t>PassiveService</w:t>
+      </w:r>
+      <w:proofErr w:type="spellEnd"/>
+    </w:p>
+    <w:p>
+      <w:r>
+        <w:t xml:space="preserve">        │</w:t>
+      </w:r>
+    </w:p>
+    <w:p>
+      <w:r>
+        <w:t xml:space="preserve">        ▼</w:t>
+      </w:r>
+    </w:p>
+    <w:p>
+      <w:proofErr w:type="spellStart"/>
+      <w:r>
+        <w:t>BattleState</w:t>
+      </w:r>
+      <w:proofErr w:type="spellEnd"/>
+      <w:r>
+        <w:t xml:space="preserve"> Updated</w:t>
+      </w:r>
+    </w:p>
+    <w:p>
+      <w:r>
+        <w:t xml:space="preserve">        │</w:t>
+      </w:r>
+    </w:p>
+    <w:p>
+      <w:r>
+        <w:t xml:space="preserve">        ▼</w:t>
+      </w:r>
+    </w:p>
+    <w:p>
+      <w:proofErr w:type="spellStart"/>
+      <w:r>
+        <w:t>BattleScene</w:t>
+      </w:r>
+      <w:proofErr w:type="spellEnd"/>
+      <w:r>
+        <w:t xml:space="preserve"> Refresh</w:t>
+      </w:r>
+    </w:p>
+    <w:p/>
+    <w:p/>
+    <w:p>
+      <w:pPr>
+        <w:spacing w:line="278" w:lineRule="auto"/>
+        <w:jc w:val="left"/>
+      </w:pPr>
+      <w:r>
+        <w:br w:type="page"/>
+      </w:r>
+    </w:p>
+    <w:p>
+      <w:r>
+        <w:lastRenderedPageBreak/>
+        <w:t>Total Damage</w:t>
+      </w:r>
+    </w:p>
+    <w:p/>
+    <w:p>
+      <w:r>
+        <w:t>=</w:t>
+      </w:r>
+    </w:p>
+    <w:p/>
+    <w:p>
+      <w:r>
+        <w:t>(Attack + Skill Power)</w:t>
+      </w:r>
+    </w:p>
+    <w:p/>
+    <w:p>
+      <w:r>
+        <w:t>×</w:t>
+      </w:r>
+    </w:p>
+    <w:p/>
+    <w:p>
+      <w:r>
+        <w:t>Critical</w:t>
+      </w:r>
+    </w:p>
+    <w:p/>
+    <w:p>
+      <w:r>
+        <w:t>×</w:t>
+      </w:r>
+    </w:p>
+    <w:p/>
+    <w:p>
+      <w:r>
+        <w:t>Random</w:t>
+      </w:r>
+    </w:p>
+    <w:p/>
+    <w:p>
+      <w:r>
+        <w:t>×</w:t>
+      </w:r>
+    </w:p>
+    <w:p/>
+    <w:p>
+      <w:r>
+        <w:t>Guard</w:t>
+      </w:r>
+    </w:p>
+    <w:p/>
+    <w:p>
+      <w:r>
+        <w:t>− Defense</w:t>
+      </w:r>
+    </w:p>
+    <w:p>
+      <w:pPr>
+        <w:spacing w:line="278" w:lineRule="auto"/>
+        <w:jc w:val="left"/>
+      </w:pPr>
+      <w:r>
+        <w:br w:type="page"/>
+      </w:r>
+    </w:p>
+    <w:p>
+      <w:r>
+        <w:lastRenderedPageBreak/>
+        <w:t>Discord Button</w:t>
+      </w:r>
+    </w:p>
+    <w:p/>
+    <w:p>
+      <w:r>
+        <w:t xml:space="preserve">        │</w:t>
+      </w:r>
+    </w:p>
+    <w:p/>
+    <w:p>
+      <w:r>
+        <w:t xml:space="preserve">        ▼</w:t>
+      </w:r>
+    </w:p>
+    <w:p/>
+    <w:p>
+      <w:proofErr w:type="spellStart"/>
+      <w:r>
+        <w:t>BattleEngine</w:t>
+      </w:r>
+      <w:proofErr w:type="spellEnd"/>
+    </w:p>
+    <w:p/>
+    <w:p>
+      <w:r>
+        <w:t xml:space="preserve">        │</w:t>
+      </w:r>
+    </w:p>
+    <w:p/>
+    <w:p>
+      <w:r>
+        <w:t xml:space="preserve">        ├── </w:t>
+      </w:r>
+      <w:proofErr w:type="spellStart"/>
+      <w:r>
+        <w:t>HeroMemoryService</w:t>
+      </w:r>
+      <w:proofErr w:type="spellEnd"/>
+    </w:p>
+    <w:p>
+      <w:r>
+        <w:t xml:space="preserve">        ├── </w:t>
+      </w:r>
+      <w:proofErr w:type="spellStart"/>
+      <w:r>
+        <w:t>DamageService</w:t>
+      </w:r>
+      <w:proofErr w:type="spellEnd"/>
+    </w:p>
+    <w:p>
+      <w:r>
+        <w:t xml:space="preserve">        ├── </w:t>
+      </w:r>
+      <w:proofErr w:type="spellStart"/>
+      <w:r>
+        <w:t>LuckService</w:t>
+      </w:r>
+      <w:proofErr w:type="spellEnd"/>
+    </w:p>
+    <w:p>
+      <w:r>
+        <w:t xml:space="preserve">        ├── </w:t>
+      </w:r>
+      <w:proofErr w:type="spellStart"/>
+      <w:r>
+        <w:t>CooldownService</w:t>
+      </w:r>
+      <w:proofErr w:type="spellEnd"/>
+    </w:p>
+    <w:p>
+      <w:r>
+        <w:t xml:space="preserve">        ├── </w:t>
+      </w:r>
+      <w:proofErr w:type="spellStart"/>
+      <w:r>
+        <w:t>BattleState</w:t>
+      </w:r>
+      <w:proofErr w:type="spellEnd"/>
+    </w:p>
+    <w:p>
+      <w:r>
+        <w:t xml:space="preserve">        └── </w:t>
+      </w:r>
+      <w:proofErr w:type="spellStart"/>
+      <w:r>
+        <w:t>BattleScene</w:t>
+      </w:r>
+      <w:proofErr w:type="spellEnd"/>
     </w:p>
     <w:sectPr>
       <w:pgSz w:w="12240" w:h="15840"/>
@@ -11156,7 +11487,7 @@
 </file>
 
 <file path=word/numbering.xml><?xml version="1.0" encoding="utf-8"?>
-<w:numbering xmlns:wpc="http://schemas.microsoft.com/office/word/2010/wordprocessingCanvas" xmlns:cx="http://schemas.microsoft.com/office/drawing/2014/chartex" xmlns:cx1="http://schemas.microsoft.com/office/drawing/2015/9/8/chartex" xmlns:cx2="http://schemas.microsoft.com/office/drawing/2015/10/21/chartex" xmlns:cx3="http://schemas.microsoft.com/office/drawing/2016/5/9/chartex" xmlns:cx4="http://schemas.microsoft.com/office/drawing/2016/5/10/chartex" xmlns:cx5="http://schemas.microsoft.com/office/drawing/2016/5/11/chartex" xmlns:cx6="http://schemas.microsoft.com/office/drawing/2016/5/12/chartex" xmlns:cx7="http://schemas.microsoft.com/office/drawing/2016/5/13/chartex" xmlns:cx8="http://schemas.microsoft.com/office/drawing/2016/5/14/chartex" xmlns:mc="http://schemas.openxmlformats.org/markup-compatibility/2006" xmlns:aink="http://schemas.microsoft.com/office/drawing/2016/ink" xmlns:am3d="http://schemas.microsoft.com/office/drawing/2017/model3d" xmlns:o="urn:schemas-microsoft-com:office:office" xmlns:oel="http://schemas.microsoft.com/office/2019/extlst" xmlns:r="http://schemas.openxmlformats.org/officeDocument/2006/relationships" xmlns:m="http://schemas.openxmlformats.org/officeDocument/2006/math" xmlns:v="urn:schemas-microsoft-com:vml" xmlns:wp14="http://schemas.microsoft.com/office/word/2010/wordprocessingDrawing" xmlns:wp="http://schemas.openxmlformats.org/drawingml/2006/wordprocessingDrawing" xmlns:w10="urn:schemas-microsoft-com:office:word" xmlns:w="http://schemas.openxmlformats.org/wordprocessingml/2006/main" xmlns:w14="http://schemas.microsoft.com/office/word/2010/wordml" xmlns:w15="http://schemas.microsoft.com/office/word/2012/wordml" xmlns:w16cex="http://schemas.microsoft.com/office/word/2018/wordml/cex" xmlns:w16cid="http://schemas.microsoft.com/office/word/2016/wordml/cid" xmlns:w16="http://schemas.microsoft.com/office/word/2018/wordml" xmlns:w16du="http://schemas.microsoft.com/office/word/2023/wordml/word16du" xmlns:w16sdtdh="http://schemas.microsoft.com/office/word/2020/wordml/sdtdatahash" xmlns:w16sdtfl="http://schemas.microsoft.com/office/word/2024/wordml/sdtformatlock" xmlns:w16se="http://schemas.microsoft.com/office/word/2015/wordml/symex" xmlns:wpg="http://schemas.microsoft.com/office/word/2010/wordprocessingGroup" xmlns:wpi="http://schemas.microsoft.com/office/word/2010/wordprocessingInk" xmlns:wne="http://schemas.microsoft.com/office/word/2006/wordml" xmlns:wps="http://schemas.microsoft.com/office/word/2010/wordprocessingShape" mc:Ignorable="w14 w15 w16se w16cid w16 w16cex w16sdtdh w16sdtfl w16du wp14">
+<w:numbering xmlns:wpc="http://schemas.microsoft.com/office/word/2010/wordprocessingCanvas" xmlns:cx="http://schemas.microsoft.com/office/drawing/2014/chartex" xmlns:cx1="http://schemas.microsoft.com/office/drawing/2015/9/8/chartex" xmlns:cx2="http://schemas.microsoft.com/office/drawing/2015/10/21/chartex" xmlns:cx3="http://schemas.microsoft.com/office/drawing/2016/5/9/chartex" xmlns:cx4="http://schemas.microsoft.com/office/drawing/2016/5/10/chartex" xmlns:cx5="http://schemas.microsoft.com/office/drawing/2016/5/11/chartex" xmlns:cx6="http://schemas.microsoft.com/office/drawing/2016/5/12/chartex" xmlns:cx7="http://schemas.microsoft.com/office/drawing/2016/5/13/chartex" xmlns:cx8="http://schemas.microsoft.com/office/drawing/2016/5/14/chartex" xmlns:mc="http://schemas.openxmlformats.org/markup-compatibility/2006" xmlns:aink="http://schemas.microsoft.com/office/drawing/2016/ink" xmlns:am3d="http://schemas.microsoft.com/office/drawing/2017/model3d" xmlns:o="urn:schemas-microsoft-com:office:office" xmlns:oel="http://schemas.microsoft.com/office/2019/extlst" xmlns:r="http://schemas.openxmlformats.org/officeDocument/2006/relationships" xmlns:m="http://schemas.openxmlformats.org/officeDocument/2006/math" xmlns:v="urn:schemas-microsoft-com:vml" xmlns:wp14="http://schemas.microsoft.com/office/word/2010/wordprocessingDrawing" xmlns:wp="http://schemas.openxmlformats.org/drawingml/2006/wordprocessingDrawing" xmlns:w10="urn:schemas-microsoft-com:office:word" xmlns:w="http://schemas.openxmlformats.org/wordprocessingml/2006/main" xmlns:w14="http://schemas.microsoft.com/office/word/2010/wordml" xmlns:w15="http://schemas.microsoft.com/office/word/2012/wordml" xmlns:w16cei="http://schemas.microsoft.com/office/word/2026/wordml/cei" xmlns:w16cex="http://schemas.microsoft.com/office/word/2018/wordml/cex" xmlns:w16cid="http://schemas.microsoft.com/office/word/2016/wordml/cid" xmlns:w16="http://schemas.microsoft.com/office/word/2018/wordml" xmlns:w16du="http://schemas.microsoft.com/office/word/2023/wordml/word16du" xmlns:w16sdtdh="http://schemas.microsoft.com/office/word/2020/wordml/sdtdatahash" xmlns:w16sdtfl="http://schemas.microsoft.com/office/word/2024/wordml/sdtformatlock" xmlns:w16se="http://schemas.microsoft.com/office/word/2015/wordml/symex" xmlns:wpg="http://schemas.microsoft.com/office/word/2010/wordprocessingGroup" xmlns:wpi="http://schemas.microsoft.com/office/word/2010/wordprocessingInk" xmlns:wne="http://schemas.microsoft.com/office/word/2006/wordml" xmlns:wps="http://schemas.microsoft.com/office/word/2010/wordprocessingShape" mc:Ignorable="w14 w15 w16se w16cid w16 w16cex w16sdtdh w16sdtfl w16du wp14">
   <w:abstractNum w:abstractNumId="0" w15:restartNumberingAfterBreak="0">
     <w:nsid w:val="04DB6E91"/>
     <w:multiLevelType w:val="multilevel"/>
@@ -13911,6 +14242,7 @@
   <w:style w:type="character" w:default="1" w:styleId="DefaultParagraphFont">
     <w:name w:val="Default Paragraph Font"/>
     <w:uiPriority w:val="1"/>
+    <w:semiHidden/>
     <w:unhideWhenUsed/>
   </w:style>
   <w:style w:type="table" w:default="1" w:styleId="TableNormal">

</xml_diff>